<commit_message>
Dolgozat vége, hiányzók pótlása
</commit_message>
<xml_diff>
--- a/notes/doga1_A.docx
+++ b/notes/doga1_A.docx
@@ -1,6 +1,6 @@
 
 <file path=word/document.xml><?xml version="1.0" encoding="utf-8"?>
-<w:document xmlns:wpc="http://schemas.microsoft.com/office/word/2010/wordprocessingCanvas" xmlns:cx="http://schemas.microsoft.com/office/drawing/2014/chartex" xmlns:cx1="http://schemas.microsoft.com/office/drawing/2015/9/8/chartex" xmlns:cx2="http://schemas.microsoft.com/office/drawing/2015/10/21/chartex" xmlns:cx3="http://schemas.microsoft.com/office/drawing/2016/5/9/chartex" xmlns:cx4="http://schemas.microsoft.com/office/drawing/2016/5/10/chartex" xmlns:cx5="http://schemas.microsoft.com/office/drawing/2016/5/11/chartex" xmlns:cx6="http://schemas.microsoft.com/office/drawing/2016/5/12/chartex" xmlns:cx7="http://schemas.microsoft.com/office/drawing/2016/5/13/chartex" xmlns:cx8="http://schemas.microsoft.com/office/drawing/2016/5/14/chartex" xmlns:mc="http://schemas.openxmlformats.org/markup-compatibility/2006" xmlns:aink="http://schemas.microsoft.com/office/drawing/2016/ink" xmlns:am3d="http://schemas.microsoft.com/office/drawing/2017/model3d" xmlns:o="urn:schemas-microsoft-com:office:office" xmlns:r="http://schemas.openxmlformats.org/officeDocument/2006/relationships" xmlns:m="http://schemas.openxmlformats.org/officeDocument/2006/math" xmlns:v="urn:schemas-microsoft-com:vml" xmlns:wp14="http://schemas.microsoft.com/office/word/2010/wordprocessingDrawing" xmlns:wp="http://schemas.openxmlformats.org/drawingml/2006/wordprocessingDrawing" xmlns:w10="urn:schemas-microsoft-com:office:word" xmlns:w="http://schemas.openxmlformats.org/wordprocessingml/2006/main" xmlns:w14="http://schemas.microsoft.com/office/word/2010/wordml" xmlns:w15="http://schemas.microsoft.com/office/word/2012/wordml" xmlns:w16cex="http://schemas.microsoft.com/office/word/2018/wordml/cex" xmlns:w16cid="http://schemas.microsoft.com/office/word/2016/wordml/cid" xmlns:w16="http://schemas.microsoft.com/office/word/2018/wordml" xmlns:w16sdtdh="http://schemas.microsoft.com/office/word/2020/wordml/sdtdatahash" xmlns:w16se="http://schemas.microsoft.com/office/word/2015/wordml/symex" xmlns:wpg="http://schemas.microsoft.com/office/word/2010/wordprocessingGroup" xmlns:wpi="http://schemas.microsoft.com/office/word/2010/wordprocessingInk" xmlns:wne="http://schemas.microsoft.com/office/word/2006/wordml" xmlns:wps="http://schemas.microsoft.com/office/word/2010/wordprocessingShape" mc:Ignorable="w14 w15 w16se w16cid w16 w16cex w16sdtdh wp14">
+<w:document xmlns:wpc="http://schemas.microsoft.com/office/word/2010/wordprocessingCanvas" xmlns:cx="http://schemas.microsoft.com/office/drawing/2014/chartex" xmlns:cx1="http://schemas.microsoft.com/office/drawing/2015/9/8/chartex" xmlns:cx2="http://schemas.microsoft.com/office/drawing/2015/10/21/chartex" xmlns:cx3="http://schemas.microsoft.com/office/drawing/2016/5/9/chartex" xmlns:cx4="http://schemas.microsoft.com/office/drawing/2016/5/10/chartex" xmlns:cx5="http://schemas.microsoft.com/office/drawing/2016/5/11/chartex" xmlns:cx6="http://schemas.microsoft.com/office/drawing/2016/5/12/chartex" xmlns:cx7="http://schemas.microsoft.com/office/drawing/2016/5/13/chartex" xmlns:cx8="http://schemas.microsoft.com/office/drawing/2016/5/14/chartex" xmlns:mc="http://schemas.openxmlformats.org/markup-compatibility/2006" xmlns:aink="http://schemas.microsoft.com/office/drawing/2016/ink" xmlns:am3d="http://schemas.microsoft.com/office/drawing/2017/model3d" xmlns:o="urn:schemas-microsoft-com:office:office" xmlns:oel="http://schemas.microsoft.com/office/2019/extlst" xmlns:r="http://schemas.openxmlformats.org/officeDocument/2006/relationships" xmlns:m="http://schemas.openxmlformats.org/officeDocument/2006/math" xmlns:v="urn:schemas-microsoft-com:vml" xmlns:wp14="http://schemas.microsoft.com/office/word/2010/wordprocessingDrawing" xmlns:wp="http://schemas.openxmlformats.org/drawingml/2006/wordprocessingDrawing" xmlns:w10="urn:schemas-microsoft-com:office:word" xmlns:w="http://schemas.openxmlformats.org/wordprocessingml/2006/main" xmlns:w14="http://schemas.microsoft.com/office/word/2010/wordml" xmlns:w15="http://schemas.microsoft.com/office/word/2012/wordml" xmlns:w16cex="http://schemas.microsoft.com/office/word/2018/wordml/cex" xmlns:w16cid="http://schemas.microsoft.com/office/word/2016/wordml/cid" xmlns:w16="http://schemas.microsoft.com/office/word/2018/wordml" xmlns:w16du="http://schemas.microsoft.com/office/word/2023/wordml/word16du" xmlns:w16sdtdh="http://schemas.microsoft.com/office/word/2020/wordml/sdtdatahash" xmlns:w16sdtfl="http://schemas.microsoft.com/office/word/2024/wordml/sdtformatlock" xmlns:w16se="http://schemas.microsoft.com/office/word/2015/wordml/symex" xmlns:wpg="http://schemas.microsoft.com/office/word/2010/wordprocessingGroup" xmlns:wpi="http://schemas.microsoft.com/office/word/2010/wordprocessingInk" xmlns:wne="http://schemas.microsoft.com/office/word/2006/wordml" xmlns:wps="http://schemas.microsoft.com/office/word/2010/wordprocessingShape" mc:Ignorable="w14 w15 w16se w16cid w16 w16cex w16sdtdh w16sdtfl w16du wp14">
   <w:body>
     <w:p>
       <w:pPr>
@@ -77,14 +77,30 @@
           <w:ilvl w:val="0"/>
           <w:numId w:val="1"/>
         </w:numPr>
-      </w:pPr>
-      <w:r>
+        <w:rPr>
+          <w:i/>
+          <w:iCs/>
+        </w:rPr>
+      </w:pPr>
+      <w:r>
+        <w:rPr>
+          <w:i/>
+          <w:iCs/>
+        </w:rPr>
         <w:t>A projekt neve SAJATNEV_</w:t>
       </w:r>
       <w:r>
+        <w:rPr>
+          <w:i/>
+          <w:iCs/>
+        </w:rPr>
         <w:t>GAMER</w:t>
       </w:r>
       <w:r>
+        <w:rPr>
+          <w:i/>
+          <w:iCs/>
+        </w:rPr>
         <w:t xml:space="preserve"> legyen</w:t>
       </w:r>
     </w:p>
@@ -95,11 +111,23 @@
           <w:ilvl w:val="0"/>
           <w:numId w:val="1"/>
         </w:numPr>
-      </w:pPr>
-      <w:r>
+        <w:rPr>
+          <w:b/>
+          <w:bCs/>
+        </w:rPr>
+      </w:pPr>
+      <w:r>
+        <w:rPr>
+          <w:b/>
+          <w:bCs/>
+        </w:rPr>
         <w:t>Hozd létre a minta alapján az index.html állományt</w:t>
       </w:r>
       <w:r>
+        <w:rPr>
+          <w:b/>
+          <w:bCs/>
+        </w:rPr>
         <w:t xml:space="preserve">, a megfelelő div elemekkel. </w:t>
       </w:r>
     </w:p>
@@ -110,24 +138,48 @@
           <w:ilvl w:val="0"/>
           <w:numId w:val="1"/>
         </w:numPr>
-      </w:pPr>
-      <w:r>
+        <w:rPr>
+          <w:b/>
+          <w:bCs/>
+        </w:rPr>
+      </w:pPr>
+      <w:r>
+        <w:rPr>
+          <w:b/>
+          <w:bCs/>
+        </w:rPr>
         <w:t xml:space="preserve">A felső képet egy div-be helyezd el, a div </w:t>
       </w:r>
       <w:proofErr w:type="spellStart"/>
       <w:r>
+        <w:rPr>
+          <w:b/>
+          <w:bCs/>
+        </w:rPr>
         <w:t>classneve</w:t>
       </w:r>
       <w:proofErr w:type="spellEnd"/>
       <w:r>
+        <w:rPr>
+          <w:b/>
+          <w:bCs/>
+        </w:rPr>
         <w:t xml:space="preserve"> </w:t>
       </w:r>
       <w:proofErr w:type="spellStart"/>
       <w:r>
+        <w:rPr>
+          <w:b/>
+          <w:bCs/>
+        </w:rPr>
         <w:t>fejlec</w:t>
       </w:r>
       <w:proofErr w:type="spellEnd"/>
       <w:r>
+        <w:rPr>
+          <w:b/>
+          <w:bCs/>
+        </w:rPr>
         <w:t xml:space="preserve"> legyen. </w:t>
       </w:r>
     </w:p>
@@ -138,16 +190,28 @@
           <w:ilvl w:val="0"/>
           <w:numId w:val="1"/>
         </w:numPr>
-      </w:pPr>
-      <w:r>
+        <w:rPr>
+          <w:strike/>
+        </w:rPr>
+      </w:pPr>
+      <w:r>
+        <w:rPr>
+          <w:strike/>
+        </w:rPr>
         <w:t xml:space="preserve">A menü div neve </w:t>
       </w:r>
       <w:proofErr w:type="spellStart"/>
       <w:r>
+        <w:rPr>
+          <w:strike/>
+        </w:rPr>
         <w:t>nav</w:t>
       </w:r>
       <w:proofErr w:type="spellEnd"/>
       <w:r>
+        <w:rPr>
+          <w:strike/>
+        </w:rPr>
         <w:t xml:space="preserve"> legyen</w:t>
       </w:r>
     </w:p>
@@ -158,16 +222,32 @@
           <w:ilvl w:val="0"/>
           <w:numId w:val="1"/>
         </w:numPr>
-      </w:pPr>
-      <w:r>
+        <w:rPr>
+          <w:b/>
+          <w:bCs/>
+        </w:rPr>
+      </w:pPr>
+      <w:r>
+        <w:rPr>
+          <w:b/>
+          <w:bCs/>
+        </w:rPr>
         <w:t>Hozd létre a stilus.css állományt és csatold az index.html-</w:t>
       </w:r>
       <w:proofErr w:type="spellStart"/>
       <w:r>
+        <w:rPr>
+          <w:b/>
+          <w:bCs/>
+        </w:rPr>
         <w:t>hez</w:t>
       </w:r>
       <w:proofErr w:type="spellEnd"/>
       <w:r>
+        <w:rPr>
+          <w:b/>
+          <w:bCs/>
+        </w:rPr>
         <w:t>.</w:t>
       </w:r>
     </w:p>
@@ -178,33 +258,69 @@
           <w:ilvl w:val="0"/>
           <w:numId w:val="1"/>
         </w:numPr>
-      </w:pPr>
-      <w:r>
+        <w:rPr>
+          <w:b/>
+          <w:bCs/>
+        </w:rPr>
+      </w:pPr>
+      <w:r>
+        <w:rPr>
+          <w:b/>
+          <w:bCs/>
+        </w:rPr>
         <w:t>H</w:t>
       </w:r>
       <w:r>
+        <w:rPr>
+          <w:b/>
+          <w:bCs/>
+        </w:rPr>
         <w:t>elyezd el benn</w:t>
       </w:r>
       <w:r>
+        <w:rPr>
+          <w:b/>
+          <w:bCs/>
+        </w:rPr>
         <w:t>e</w:t>
       </w:r>
       <w:r>
+        <w:rPr>
+          <w:b/>
+          <w:bCs/>
+        </w:rPr>
         <w:t xml:space="preserve"> a szokásos </w:t>
       </w:r>
       <w:proofErr w:type="spellStart"/>
       <w:r>
+        <w:rPr>
+          <w:b/>
+          <w:bCs/>
+        </w:rPr>
         <w:t>meta</w:t>
       </w:r>
       <w:proofErr w:type="spellEnd"/>
       <w:r>
+        <w:rPr>
+          <w:b/>
+          <w:bCs/>
+        </w:rPr>
         <w:t xml:space="preserve"> tag-</w:t>
       </w:r>
       <w:proofErr w:type="spellStart"/>
       <w:r>
+        <w:rPr>
+          <w:b/>
+          <w:bCs/>
+        </w:rPr>
         <w:t>eket</w:t>
       </w:r>
       <w:proofErr w:type="spellEnd"/>
       <w:r>
+        <w:rPr>
+          <w:b/>
+          <w:bCs/>
+        </w:rPr>
         <w:t>!</w:t>
       </w:r>
     </w:p>
@@ -215,14 +331,30 @@
           <w:ilvl w:val="0"/>
           <w:numId w:val="1"/>
         </w:numPr>
-      </w:pPr>
-      <w:r>
+        <w:rPr>
+          <w:b/>
+          <w:bCs/>
+        </w:rPr>
+      </w:pPr>
+      <w:r>
+        <w:rPr>
+          <w:b/>
+          <w:bCs/>
+        </w:rPr>
         <w:t>Alakítsd ki az oldal szerkezet</w:t>
       </w:r>
       <w:r>
+        <w:rPr>
+          <w:b/>
+          <w:bCs/>
+        </w:rPr>
         <w:t>ét!</w:t>
       </w:r>
       <w:r>
+        <w:rPr>
+          <w:b/>
+          <w:bCs/>
+        </w:rPr>
         <w:t xml:space="preserve"> </w:t>
       </w:r>
     </w:p>
@@ -235,14 +367,26 @@
         </w:numPr>
       </w:pPr>
       <w:r>
+        <w:rPr>
+          <w:b/>
+          <w:bCs/>
+        </w:rPr>
         <w:t xml:space="preserve">Állítsd be a </w:t>
       </w:r>
       <w:proofErr w:type="spellStart"/>
       <w:r>
+        <w:rPr>
+          <w:b/>
+          <w:bCs/>
+        </w:rPr>
         <w:t>html</w:t>
       </w:r>
       <w:proofErr w:type="spellEnd"/>
       <w:r>
+        <w:rPr>
+          <w:b/>
+          <w:bCs/>
+        </w:rPr>
         <w:t xml:space="preserve"> nyelvét magyarra.</w:t>
       </w:r>
     </w:p>
@@ -253,20 +397,38 @@
           <w:ilvl w:val="0"/>
           <w:numId w:val="1"/>
         </w:numPr>
-      </w:pPr>
-      <w:r>
+        <w:rPr>
+          <w:strike/>
+        </w:rPr>
+      </w:pPr>
+      <w:r>
+        <w:rPr>
+          <w:strike/>
+        </w:rPr>
         <w:t xml:space="preserve">Készíts másolatot az oldalról </w:t>
       </w:r>
       <w:r>
+        <w:rPr>
+          <w:strike/>
+        </w:rPr>
         <w:t>jatekok</w:t>
       </w:r>
       <w:r>
+        <w:rPr>
+          <w:strike/>
+        </w:rPr>
         <w:t xml:space="preserve">.html néven, és </w:t>
       </w:r>
       <w:r>
+        <w:rPr>
+          <w:strike/>
+        </w:rPr>
         <w:t>készíts egy játékról leírást tetszőleges tartalommal</w:t>
       </w:r>
       <w:r>
+        <w:rPr>
+          <w:strike/>
+        </w:rPr>
         <w:t>, hasonló formátumban!</w:t>
       </w:r>
     </w:p>
@@ -314,32 +476,64 @@
           <w:ilvl w:val="0"/>
           <w:numId w:val="2"/>
         </w:numPr>
-      </w:pPr>
-      <w:r>
+        <w:rPr>
+          <w:b/>
+          <w:bCs/>
+        </w:rPr>
+      </w:pPr>
+      <w:r>
+        <w:rPr>
+          <w:b/>
+          <w:bCs/>
+        </w:rPr>
         <w:t xml:space="preserve">A betűcsalád legyen </w:t>
       </w:r>
       <w:proofErr w:type="spellStart"/>
       <w:r>
+        <w:rPr>
+          <w:b/>
+          <w:bCs/>
+        </w:rPr>
         <w:t>Arial</w:t>
       </w:r>
       <w:proofErr w:type="spellEnd"/>
       <w:r>
+        <w:rPr>
+          <w:b/>
+          <w:bCs/>
+        </w:rPr>
         <w:t xml:space="preserve">, </w:t>
       </w:r>
       <w:proofErr w:type="spellStart"/>
       <w:r>
+        <w:rPr>
+          <w:b/>
+          <w:bCs/>
+        </w:rPr>
         <w:t>Verdana</w:t>
       </w:r>
       <w:proofErr w:type="spellEnd"/>
       <w:r>
+        <w:rPr>
+          <w:b/>
+          <w:bCs/>
+        </w:rPr>
         <w:t xml:space="preserve">, </w:t>
       </w:r>
       <w:proofErr w:type="spellStart"/>
       <w:r>
+        <w:rPr>
+          <w:b/>
+          <w:bCs/>
+        </w:rPr>
         <w:t>sans</w:t>
       </w:r>
       <w:proofErr w:type="spellEnd"/>
       <w:r>
+        <w:rPr>
+          <w:b/>
+          <w:bCs/>
+        </w:rPr>
         <w:t>-serif!</w:t>
       </w:r>
     </w:p>
@@ -370,8 +564,16 @@
           <w:ilvl w:val="0"/>
           <w:numId w:val="2"/>
         </w:numPr>
-      </w:pPr>
-      <w:r>
+        <w:rPr>
+          <w:b/>
+          <w:bCs/>
+        </w:rPr>
+      </w:pPr>
+      <w:r>
+        <w:rPr>
+          <w:b/>
+          <w:bCs/>
+        </w:rPr>
         <w:t xml:space="preserve">A háttérkép legyen a minta szerint. </w:t>
       </w:r>
     </w:p>
@@ -395,20 +597,440 @@
         </w:rPr>
         <w:t xml:space="preserve">A </w:t>
       </w:r>
+      <w:r>
+        <w:rPr>
+          <w:b/>
+          <w:bCs/>
+        </w:rPr>
+        <w:t xml:space="preserve">tároló </w:t>
+      </w:r>
+      <w:r>
+        <w:rPr>
+          <w:b/>
+          <w:bCs/>
+        </w:rPr>
+        <w:t xml:space="preserve"> elem szélességét állítsd </w:t>
+      </w:r>
+      <w:r>
+        <w:rPr>
+          <w:b/>
+          <w:bCs/>
+        </w:rPr>
+        <w:t>9</w:t>
+      </w:r>
+      <w:r>
+        <w:rPr>
+          <w:b/>
+          <w:bCs/>
+        </w:rPr>
+        <w:t>0%-</w:t>
+      </w:r>
+      <w:proofErr w:type="spellStart"/>
+      <w:r>
+        <w:rPr>
+          <w:b/>
+          <w:bCs/>
+        </w:rPr>
+        <w:t>ra</w:t>
+      </w:r>
+      <w:proofErr w:type="spellEnd"/>
+      <w:r>
+        <w:rPr>
+          <w:b/>
+          <w:bCs/>
+        </w:rPr>
+        <w:t>.</w:t>
+      </w:r>
+    </w:p>
+    <w:p>
+      <w:pPr>
+        <w:pStyle w:val="Listaszerbekezds"/>
+        <w:numPr>
+          <w:ilvl w:val="0"/>
+          <w:numId w:val="2"/>
+        </w:numPr>
+        <w:rPr>
+          <w:b/>
+          <w:bCs/>
+        </w:rPr>
+      </w:pPr>
+      <w:r>
+        <w:rPr>
+          <w:b/>
+          <w:bCs/>
+        </w:rPr>
+        <w:t xml:space="preserve">A </w:t>
+      </w:r>
+      <w:r>
+        <w:rPr>
+          <w:b/>
+          <w:bCs/>
+        </w:rPr>
+        <w:t xml:space="preserve">tároló </w:t>
+      </w:r>
+      <w:r>
+        <w:rPr>
+          <w:b/>
+          <w:bCs/>
+        </w:rPr>
+        <w:t xml:space="preserve"> elem ne lehessen nagyobb, mint </w:t>
+      </w:r>
+      <w:r>
+        <w:rPr>
+          <w:b/>
+          <w:bCs/>
+        </w:rPr>
+        <w:t>9</w:t>
+      </w:r>
+      <w:r>
+        <w:rPr>
+          <w:b/>
+          <w:bCs/>
+        </w:rPr>
+        <w:t>00px.</w:t>
+      </w:r>
+    </w:p>
+    <w:p>
+      <w:pPr>
+        <w:pStyle w:val="Listaszerbekezds"/>
+        <w:numPr>
+          <w:ilvl w:val="0"/>
+          <w:numId w:val="2"/>
+        </w:numPr>
+        <w:rPr>
+          <w:b/>
+          <w:bCs/>
+        </w:rPr>
+      </w:pPr>
+      <w:r>
+        <w:rPr>
+          <w:b/>
+          <w:bCs/>
+        </w:rPr>
+        <w:t>Állítsd a teljes tartalmat a böngésző közepére!</w:t>
+      </w:r>
+    </w:p>
+    <w:p>
+      <w:pPr>
+        <w:pStyle w:val="Listaszerbekezds"/>
+        <w:numPr>
+          <w:ilvl w:val="0"/>
+          <w:numId w:val="2"/>
+        </w:numPr>
+        <w:rPr>
+          <w:b/>
+          <w:bCs/>
+        </w:rPr>
+      </w:pPr>
+      <w:r>
+        <w:rPr>
+          <w:b/>
+          <w:bCs/>
+        </w:rPr>
+        <w:t xml:space="preserve">A </w:t>
+      </w:r>
+      <w:r>
+        <w:rPr>
+          <w:b/>
+          <w:bCs/>
+        </w:rPr>
+        <w:t xml:space="preserve">tároló </w:t>
+      </w:r>
+      <w:r>
+        <w:rPr>
+          <w:b/>
+          <w:bCs/>
+        </w:rPr>
+        <w:t xml:space="preserve"> elem háttérszíne legyen RGB kóddal megadva</w:t>
+      </w:r>
+      <w:r>
+        <w:rPr>
+          <w:b/>
+          <w:bCs/>
+        </w:rPr>
+        <w:t>!</w:t>
+      </w:r>
+    </w:p>
+    <w:p>
+      <w:pPr>
+        <w:pStyle w:val="Listaszerbekezds"/>
+        <w:numPr>
+          <w:ilvl w:val="0"/>
+          <w:numId w:val="2"/>
+        </w:numPr>
+        <w:rPr>
+          <w:strike/>
+        </w:rPr>
+      </w:pPr>
+      <w:r>
+        <w:rPr>
+          <w:strike/>
+        </w:rPr>
+        <w:t>Készítsd el a navigációt</w:t>
+      </w:r>
+      <w:r>
+        <w:rPr>
+          <w:strike/>
+        </w:rPr>
+        <w:t xml:space="preserve"> </w:t>
+      </w:r>
+      <w:proofErr w:type="spellStart"/>
+      <w:r>
+        <w:rPr>
+          <w:strike/>
+        </w:rPr>
+        <w:t>gridekkel</w:t>
+      </w:r>
+      <w:proofErr w:type="spellEnd"/>
+      <w:r>
+        <w:rPr>
+          <w:strike/>
+        </w:rPr>
+        <w:t>!</w:t>
+      </w:r>
+    </w:p>
+    <w:p>
+      <w:pPr>
+        <w:pStyle w:val="Listaszerbekezds"/>
+        <w:numPr>
+          <w:ilvl w:val="0"/>
+          <w:numId w:val="2"/>
+        </w:numPr>
+        <w:rPr>
+          <w:b/>
+          <w:bCs/>
+        </w:rPr>
+      </w:pPr>
+      <w:r>
+        <w:rPr>
+          <w:b/>
+          <w:bCs/>
+        </w:rPr>
+        <w:t xml:space="preserve">Formázd! Nem </w:t>
+      </w:r>
+      <w:r>
+        <w:rPr>
+          <w:b/>
+          <w:bCs/>
+        </w:rPr>
+        <w:t xml:space="preserve"> baj, ha nem pont így néz ki! A szöveg ne legyen aláhúzva, a betűszín legyen fehér!</w:t>
+      </w:r>
+    </w:p>
+    <w:p>
+      <w:pPr>
+        <w:pStyle w:val="Listaszerbekezds"/>
+        <w:numPr>
+          <w:ilvl w:val="0"/>
+          <w:numId w:val="2"/>
+        </w:numPr>
+        <w:rPr>
+          <w:b/>
+          <w:bCs/>
+        </w:rPr>
+      </w:pPr>
+      <w:r>
+        <w:rPr>
+          <w:b/>
+          <w:bCs/>
+        </w:rPr>
+        <w:t>Ha a navigáció eleme</w:t>
+      </w:r>
+      <w:r>
+        <w:rPr>
+          <w:b/>
+          <w:bCs/>
+        </w:rPr>
+        <w:t>i</w:t>
+      </w:r>
+      <w:r>
+        <w:rPr>
+          <w:b/>
+          <w:bCs/>
+        </w:rPr>
+        <w:t xml:space="preserve"> fölé viszem az egeret, a </w:t>
+      </w:r>
+      <w:r>
+        <w:rPr>
+          <w:b/>
+          <w:bCs/>
+        </w:rPr>
+        <w:t xml:space="preserve">betűszín </w:t>
+      </w:r>
+      <w:r>
+        <w:rPr>
+          <w:b/>
+          <w:bCs/>
+        </w:rPr>
+        <w:t xml:space="preserve"> változzon </w:t>
+      </w:r>
+      <w:r>
+        <w:rPr>
+          <w:b/>
+          <w:bCs/>
+        </w:rPr>
+        <w:t>narancssárga</w:t>
+      </w:r>
+      <w:r>
+        <w:rPr>
+          <w:b/>
+          <w:bCs/>
+        </w:rPr>
+        <w:t xml:space="preserve"> színűre</w:t>
+      </w:r>
+      <w:r>
+        <w:rPr>
+          <w:b/>
+          <w:bCs/>
+        </w:rPr>
+        <w:t>!</w:t>
+      </w:r>
+    </w:p>
+    <w:p>
+      <w:pPr>
+        <w:pStyle w:val="Listaszerbekezds"/>
+        <w:numPr>
+          <w:ilvl w:val="0"/>
+          <w:numId w:val="2"/>
+        </w:numPr>
+        <w:contextualSpacing w:val="0"/>
+        <w:rPr>
+          <w:b/>
+          <w:bCs/>
+        </w:rPr>
+      </w:pPr>
+      <w:r>
+        <w:rPr>
+          <w:b/>
+          <w:bCs/>
+        </w:rPr>
+        <w:t xml:space="preserve">A navigáció linkjei legyenek vastag </w:t>
+      </w:r>
+      <w:proofErr w:type="spellStart"/>
+      <w:r>
+        <w:rPr>
+          <w:b/>
+          <w:bCs/>
+        </w:rPr>
+        <w:t>betűse</w:t>
+      </w:r>
+      <w:r>
+        <w:rPr>
+          <w:b/>
+          <w:bCs/>
+        </w:rPr>
+        <w:t>k</w:t>
+      </w:r>
+      <w:proofErr w:type="spellEnd"/>
+      <w:r>
+        <w:rPr>
+          <w:b/>
+          <w:bCs/>
+        </w:rPr>
+        <w:t xml:space="preserve">. </w:t>
+      </w:r>
+    </w:p>
+    <w:p>
+      <w:pPr>
+        <w:pStyle w:val="Listaszerbekezds"/>
+        <w:numPr>
+          <w:ilvl w:val="0"/>
+          <w:numId w:val="2"/>
+        </w:numPr>
+        <w:contextualSpacing w:val="0"/>
+        <w:rPr>
+          <w:b/>
+          <w:bCs/>
+        </w:rPr>
+      </w:pPr>
+      <w:r>
+        <w:rPr>
+          <w:b/>
+          <w:bCs/>
+        </w:rPr>
+        <w:t>A</w:t>
+      </w:r>
+      <w:r>
+        <w:rPr>
+          <w:b/>
+          <w:bCs/>
+        </w:rPr>
+        <w:t xml:space="preserve"> </w:t>
+      </w:r>
+      <w:r>
+        <w:rPr>
+          <w:b/>
+          <w:bCs/>
+        </w:rPr>
+        <w:t xml:space="preserve">bekezdések legyenek sorkizárt igazításúak. </w:t>
+      </w:r>
+    </w:p>
+    <w:p>
+      <w:pPr>
+        <w:pStyle w:val="Listaszerbekezds"/>
+        <w:numPr>
+          <w:ilvl w:val="0"/>
+          <w:numId w:val="2"/>
+        </w:numPr>
+        <w:rPr>
+          <w:b/>
+          <w:bCs/>
+        </w:rPr>
+      </w:pPr>
+      <w:r>
+        <w:rPr>
+          <w:b/>
+          <w:bCs/>
+        </w:rPr>
+        <w:t>A</w:t>
+      </w:r>
+      <w:r>
+        <w:rPr>
+          <w:b/>
+          <w:bCs/>
+        </w:rPr>
+        <w:t xml:space="preserve"> </w:t>
+      </w:r>
+      <w:r>
+        <w:rPr>
+          <w:b/>
+          <w:bCs/>
+        </w:rPr>
+        <w:t>bekezdések betű mérete legyen 10px!</w:t>
+      </w:r>
+    </w:p>
+    <w:p>
+      <w:pPr>
+        <w:pStyle w:val="Listaszerbekezds"/>
+        <w:numPr>
+          <w:ilvl w:val="0"/>
+          <w:numId w:val="2"/>
+        </w:numPr>
+        <w:rPr>
+          <w:b/>
+          <w:bCs/>
+        </w:rPr>
+      </w:pPr>
+      <w:r>
+        <w:rPr>
+          <w:b/>
+          <w:bCs/>
+        </w:rPr>
+        <w:t xml:space="preserve">A </w:t>
+      </w:r>
+      <w:r>
+        <w:rPr>
+          <w:b/>
+          <w:bCs/>
+        </w:rPr>
+        <w:t xml:space="preserve"> </w:t>
+      </w:r>
       <w:proofErr w:type="gramStart"/>
       <w:r>
         <w:rPr>
           <w:b/>
           <w:bCs/>
         </w:rPr>
-        <w:t xml:space="preserve">tároló </w:t>
-      </w:r>
-      <w:r>
-        <w:rPr>
-          <w:b/>
-          <w:bCs/>
-        </w:rPr>
-        <w:t xml:space="preserve"> elem</w:t>
+        <w:t>cím betű</w:t>
       </w:r>
       <w:proofErr w:type="gramEnd"/>
       <w:r>
@@ -416,21 +1038,37 @@
           <w:b/>
           <w:bCs/>
         </w:rPr>
-        <w:t xml:space="preserve"> szélességét állítsd </w:t>
-      </w:r>
-      <w:r>
-        <w:rPr>
-          <w:b/>
-          <w:bCs/>
-        </w:rPr>
-        <w:t>9</w:t>
-      </w:r>
-      <w:r>
-        <w:rPr>
-          <w:b/>
-          <w:bCs/>
-        </w:rPr>
-        <w:t>0%-</w:t>
+        <w:t xml:space="preserve"> mérete legyen 15px!</w:t>
+      </w:r>
+    </w:p>
+    <w:p>
+      <w:pPr>
+        <w:pStyle w:val="Listaszerbekezds"/>
+        <w:numPr>
+          <w:ilvl w:val="0"/>
+          <w:numId w:val="2"/>
+        </w:numPr>
+      </w:pPr>
+      <w:r>
+        <w:rPr>
+          <w:b/>
+          <w:bCs/>
+        </w:rPr>
+        <w:t>A</w:t>
+      </w:r>
+      <w:r>
+        <w:rPr>
+          <w:b/>
+          <w:bCs/>
+        </w:rPr>
+        <w:t xml:space="preserve"> </w:t>
+      </w:r>
+      <w:r>
+        <w:rPr>
+          <w:b/>
+          <w:bCs/>
+        </w:rPr>
+        <w:t xml:space="preserve">kép </w:t>
       </w:r>
       <w:proofErr w:type="spellStart"/>
       <w:r>
@@ -438,7 +1076,7 @@
           <w:b/>
           <w:bCs/>
         </w:rPr>
-        <w:t>ra</w:t>
+        <w:t>ússzon</w:t>
       </w:r>
       <w:proofErr w:type="spellEnd"/>
       <w:r>
@@ -446,7 +1084,51 @@
           <w:b/>
           <w:bCs/>
         </w:rPr>
-        <w:t>.</w:t>
+        <w:t xml:space="preserve"> el a szöveg mellé </w:t>
+      </w:r>
+      <w:r>
+        <w:rPr>
+          <w:b/>
+          <w:bCs/>
+        </w:rPr>
+        <w:t>jobbra</w:t>
+      </w:r>
+      <w:r>
+        <w:rPr>
+          <w:b/>
+          <w:bCs/>
+        </w:rPr>
+        <w:t xml:space="preserve">. </w:t>
+      </w:r>
+      <w:r>
+        <w:rPr>
+          <w:b/>
+          <w:bCs/>
+        </w:rPr>
+        <w:t>Ne felejtsd el megszüntetni az úsztatást az oldal alján!</w:t>
+      </w:r>
+      <w:r>
+        <w:t xml:space="preserve"> </w:t>
+      </w:r>
+      <w:r>
+        <w:rPr>
+          <w:strike/>
+        </w:rPr>
+        <w:t xml:space="preserve">Vagy használhatsz </w:t>
+      </w:r>
+      <w:proofErr w:type="spellStart"/>
+      <w:r>
+        <w:rPr>
+          <w:strike/>
+        </w:rPr>
+        <w:t>grideket</w:t>
+      </w:r>
+      <w:proofErr w:type="spellEnd"/>
+      <w:r>
+        <w:rPr>
+          <w:strike/>
+        </w:rPr>
+        <w:t xml:space="preserve"> is az elrendezéshez.</w:t>
       </w:r>
     </w:p>
     <w:p>
@@ -456,56 +1138,41 @@
           <w:ilvl w:val="0"/>
           <w:numId w:val="2"/>
         </w:numPr>
-        <w:rPr>
-          <w:b/>
-          <w:bCs/>
-        </w:rPr>
-      </w:pPr>
-      <w:r>
-        <w:rPr>
-          <w:b/>
-          <w:bCs/>
-        </w:rPr>
-        <w:t xml:space="preserve">A </w:t>
-      </w:r>
-      <w:proofErr w:type="gramStart"/>
-      <w:r>
-        <w:rPr>
-          <w:b/>
-          <w:bCs/>
-        </w:rPr>
-        <w:t xml:space="preserve">tároló </w:t>
-      </w:r>
-      <w:r>
-        <w:rPr>
-          <w:b/>
-          <w:bCs/>
-        </w:rPr>
-        <w:t xml:space="preserve"> elem</w:t>
-      </w:r>
-      <w:proofErr w:type="gramEnd"/>
-      <w:r>
-        <w:rPr>
-          <w:b/>
-          <w:bCs/>
-        </w:rPr>
-        <w:t xml:space="preserve"> ne lehessen nagyobb, mint </w:t>
-      </w:r>
-      <w:r>
-        <w:rPr>
-          <w:b/>
-          <w:bCs/>
-        </w:rPr>
-        <w:t>9</w:t>
-      </w:r>
-      <w:r>
-        <w:rPr>
-          <w:b/>
-          <w:bCs/>
-        </w:rPr>
-        <w:t>00px.</w:t>
-      </w:r>
-    </w:p>
+      </w:pPr>
+      <w:r>
+        <w:rPr>
+          <w:b/>
+          <w:bCs/>
+        </w:rPr>
+        <w:t xml:space="preserve">A felsorolások előtti jel legyen </w:t>
+      </w:r>
+      <w:proofErr w:type="spellStart"/>
+      <w:r>
+        <w:rPr>
+          <w:b/>
+          <w:bCs/>
+        </w:rPr>
+        <w:t>square</w:t>
+      </w:r>
+      <w:proofErr w:type="spellEnd"/>
+      <w:r>
+        <w:rPr>
+          <w:b/>
+          <w:bCs/>
+        </w:rPr>
+        <w:t xml:space="preserve"> (négyzet).</w:t>
+      </w:r>
+      <w:r>
+        <w:t xml:space="preserve"> </w:t>
+      </w:r>
+      <w:r>
+        <w:rPr>
+          <w:strike/>
+        </w:rPr>
+        <w:t xml:space="preserve">Az oldal legyen reszponzív! </w:t>
+      </w:r>
+    </w:p>
+    <w:p/>
     <w:p>
       <w:pPr>
         <w:pStyle w:val="Listaszerbekezds"/>
@@ -514,52 +1181,6 @@
           <w:numId w:val="2"/>
         </w:numPr>
         <w:rPr>
-          <w:b/>
-          <w:bCs/>
-        </w:rPr>
-      </w:pPr>
-      <w:r>
-        <w:rPr>
-          <w:b/>
-          <w:bCs/>
-        </w:rPr>
-        <w:t>Állítsd a teljes tartalmat a böngésző közepére!</w:t>
-      </w:r>
-    </w:p>
-    <w:p>
-      <w:pPr>
-        <w:pStyle w:val="Listaszerbekezds"/>
-        <w:numPr>
-          <w:ilvl w:val="0"/>
-          <w:numId w:val="2"/>
-        </w:numPr>
-      </w:pPr>
-      <w:r>
-        <w:t xml:space="preserve">A </w:t>
-      </w:r>
-      <w:proofErr w:type="gramStart"/>
-      <w:r>
-        <w:t xml:space="preserve">tároló </w:t>
-      </w:r>
-      <w:r>
-        <w:t xml:space="preserve"> elem</w:t>
-      </w:r>
-      <w:proofErr w:type="gramEnd"/>
-      <w:r>
-        <w:t xml:space="preserve"> háttérszíne legyen RGB kóddal megadva</w:t>
-      </w:r>
-      <w:r>
-        <w:t>!</w:t>
-      </w:r>
-    </w:p>
-    <w:p>
-      <w:pPr>
-        <w:pStyle w:val="Listaszerbekezds"/>
-        <w:numPr>
-          <w:ilvl w:val="0"/>
-          <w:numId w:val="2"/>
-        </w:numPr>
-        <w:rPr>
           <w:strike/>
         </w:rPr>
       </w:pPr>
@@ -567,429 +1188,7 @@
         <w:rPr>
           <w:strike/>
         </w:rPr>
-        <w:t>Készítsd el a navigációt</w:t>
-      </w:r>
-      <w:r>
-        <w:rPr>
-          <w:strike/>
-        </w:rPr>
-        <w:t xml:space="preserve"> </w:t>
-      </w:r>
-      <w:proofErr w:type="spellStart"/>
-      <w:r>
-        <w:rPr>
-          <w:strike/>
-        </w:rPr>
-        <w:t>gridekkel</w:t>
-      </w:r>
-      <w:proofErr w:type="spellEnd"/>
-      <w:r>
-        <w:rPr>
-          <w:strike/>
-        </w:rPr>
-        <w:t>!</w:t>
-      </w:r>
-    </w:p>
-    <w:p>
-      <w:pPr>
-        <w:pStyle w:val="Listaszerbekezds"/>
-        <w:numPr>
-          <w:ilvl w:val="0"/>
-          <w:numId w:val="2"/>
-        </w:numPr>
-        <w:rPr>
-          <w:b/>
-          <w:bCs/>
-        </w:rPr>
-      </w:pPr>
-      <w:r>
-        <w:rPr>
-          <w:b/>
-          <w:bCs/>
-        </w:rPr>
-        <w:t xml:space="preserve">Formázd! </w:t>
-      </w:r>
-      <w:proofErr w:type="gramStart"/>
-      <w:r>
-        <w:rPr>
-          <w:b/>
-          <w:bCs/>
-        </w:rPr>
-        <w:t xml:space="preserve">Nem </w:t>
-      </w:r>
-      <w:r>
-        <w:rPr>
-          <w:b/>
-          <w:bCs/>
-        </w:rPr>
-        <w:t xml:space="preserve"> baj</w:t>
-      </w:r>
-      <w:proofErr w:type="gramEnd"/>
-      <w:r>
-        <w:rPr>
-          <w:b/>
-          <w:bCs/>
-        </w:rPr>
-        <w:t>, ha nem pont így néz ki! A szöveg ne legyen aláhúzva, a betűszín legyen fehér!</w:t>
-      </w:r>
-    </w:p>
-    <w:p>
-      <w:pPr>
-        <w:pStyle w:val="Listaszerbekezds"/>
-        <w:numPr>
-          <w:ilvl w:val="0"/>
-          <w:numId w:val="2"/>
-        </w:numPr>
-        <w:rPr>
-          <w:b/>
-          <w:bCs/>
-        </w:rPr>
-      </w:pPr>
-      <w:r>
-        <w:rPr>
-          <w:b/>
-          <w:bCs/>
-        </w:rPr>
-        <w:t>Ha a navigáció eleme</w:t>
-      </w:r>
-      <w:r>
-        <w:rPr>
-          <w:b/>
-          <w:bCs/>
-        </w:rPr>
-        <w:t>i</w:t>
-      </w:r>
-      <w:r>
-        <w:rPr>
-          <w:b/>
-          <w:bCs/>
-        </w:rPr>
-        <w:t xml:space="preserve"> fölé viszem az egeret, a </w:t>
-      </w:r>
-      <w:proofErr w:type="gramStart"/>
-      <w:r>
-        <w:rPr>
-          <w:b/>
-          <w:bCs/>
-        </w:rPr>
-        <w:t xml:space="preserve">betűszín </w:t>
-      </w:r>
-      <w:r>
-        <w:rPr>
-          <w:b/>
-          <w:bCs/>
-        </w:rPr>
-        <w:t xml:space="preserve"> változzon</w:t>
-      </w:r>
-      <w:proofErr w:type="gramEnd"/>
-      <w:r>
-        <w:rPr>
-          <w:b/>
-          <w:bCs/>
-        </w:rPr>
-        <w:t xml:space="preserve"> </w:t>
-      </w:r>
-      <w:r>
-        <w:rPr>
-          <w:b/>
-          <w:bCs/>
-        </w:rPr>
-        <w:t>narancssárga</w:t>
-      </w:r>
-      <w:r>
-        <w:rPr>
-          <w:b/>
-          <w:bCs/>
-        </w:rPr>
-        <w:t xml:space="preserve"> színűre</w:t>
-      </w:r>
-      <w:r>
-        <w:rPr>
-          <w:b/>
-          <w:bCs/>
-        </w:rPr>
-        <w:t>!</w:t>
-      </w:r>
-    </w:p>
-    <w:p>
-      <w:pPr>
-        <w:pStyle w:val="Listaszerbekezds"/>
-        <w:numPr>
-          <w:ilvl w:val="0"/>
-          <w:numId w:val="2"/>
-        </w:numPr>
-        <w:contextualSpacing w:val="0"/>
-        <w:rPr>
-          <w:b/>
-          <w:bCs/>
-        </w:rPr>
-      </w:pPr>
-      <w:r>
-        <w:rPr>
-          <w:b/>
-          <w:bCs/>
-        </w:rPr>
-        <w:t xml:space="preserve">A navigáció linkjei legyenek vastag </w:t>
-      </w:r>
-      <w:proofErr w:type="spellStart"/>
-      <w:r>
-        <w:rPr>
-          <w:b/>
-          <w:bCs/>
-        </w:rPr>
-        <w:t>betűse</w:t>
-      </w:r>
-      <w:r>
-        <w:rPr>
-          <w:b/>
-          <w:bCs/>
-        </w:rPr>
-        <w:t>k</w:t>
-      </w:r>
-      <w:proofErr w:type="spellEnd"/>
-      <w:r>
-        <w:rPr>
-          <w:b/>
-          <w:bCs/>
-        </w:rPr>
-        <w:t xml:space="preserve">. </w:t>
-      </w:r>
-    </w:p>
-    <w:p>
-      <w:pPr>
-        <w:pStyle w:val="Listaszerbekezds"/>
-        <w:numPr>
-          <w:ilvl w:val="0"/>
-          <w:numId w:val="2"/>
-        </w:numPr>
-        <w:contextualSpacing w:val="0"/>
-        <w:rPr>
-          <w:b/>
-          <w:bCs/>
-        </w:rPr>
-      </w:pPr>
-      <w:r>
-        <w:rPr>
-          <w:b/>
-          <w:bCs/>
-        </w:rPr>
-        <w:t>A</w:t>
-      </w:r>
-      <w:r>
-        <w:rPr>
-          <w:b/>
-          <w:bCs/>
-        </w:rPr>
-        <w:t xml:space="preserve"> </w:t>
-      </w:r>
-      <w:r>
-        <w:rPr>
-          <w:b/>
-          <w:bCs/>
-        </w:rPr>
-        <w:t xml:space="preserve">bekezdések legyenek sorkizárt igazításúak. </w:t>
-      </w:r>
-    </w:p>
-    <w:p>
-      <w:pPr>
-        <w:pStyle w:val="Listaszerbekezds"/>
-        <w:numPr>
-          <w:ilvl w:val="0"/>
-          <w:numId w:val="2"/>
-        </w:numPr>
-        <w:rPr>
-          <w:b/>
-          <w:bCs/>
-        </w:rPr>
-      </w:pPr>
-      <w:r>
-        <w:rPr>
-          <w:b/>
-          <w:bCs/>
-        </w:rPr>
-        <w:t>A</w:t>
-      </w:r>
-      <w:r>
-        <w:rPr>
-          <w:b/>
-          <w:bCs/>
-        </w:rPr>
-        <w:t xml:space="preserve"> </w:t>
-      </w:r>
-      <w:r>
-        <w:rPr>
-          <w:b/>
-          <w:bCs/>
-        </w:rPr>
-        <w:t>bekezdések betű mérete legyen 10px!</w:t>
-      </w:r>
-    </w:p>
-    <w:p>
-      <w:pPr>
-        <w:pStyle w:val="Listaszerbekezds"/>
-        <w:numPr>
-          <w:ilvl w:val="0"/>
-          <w:numId w:val="2"/>
-        </w:numPr>
-        <w:rPr>
-          <w:b/>
-          <w:bCs/>
-        </w:rPr>
-      </w:pPr>
-      <w:proofErr w:type="gramStart"/>
-      <w:r>
-        <w:rPr>
-          <w:b/>
-          <w:bCs/>
-        </w:rPr>
-        <w:t xml:space="preserve">A </w:t>
-      </w:r>
-      <w:r>
-        <w:rPr>
-          <w:b/>
-          <w:bCs/>
-        </w:rPr>
-        <w:t xml:space="preserve"> cím</w:t>
-      </w:r>
-      <w:proofErr w:type="gramEnd"/>
-      <w:r>
-        <w:rPr>
-          <w:b/>
-          <w:bCs/>
-        </w:rPr>
-        <w:t xml:space="preserve"> betű mérete legyen 15px!</w:t>
-      </w:r>
-    </w:p>
-    <w:p>
-      <w:pPr>
-        <w:pStyle w:val="Listaszerbekezds"/>
-        <w:numPr>
-          <w:ilvl w:val="0"/>
-          <w:numId w:val="2"/>
-        </w:numPr>
-      </w:pPr>
-      <w:r>
-        <w:t>A</w:t>
-      </w:r>
-      <w:r>
-        <w:t xml:space="preserve"> </w:t>
-      </w:r>
-      <w:r>
-        <w:t xml:space="preserve">kép </w:t>
-      </w:r>
-      <w:proofErr w:type="spellStart"/>
-      <w:r>
-        <w:t>ússzon</w:t>
-      </w:r>
-      <w:proofErr w:type="spellEnd"/>
-      <w:r>
-        <w:t xml:space="preserve"> el a szöveg mellé </w:t>
-      </w:r>
-      <w:r>
-        <w:t>jobbra</w:t>
-      </w:r>
-      <w:r>
-        <w:t xml:space="preserve">. </w:t>
-      </w:r>
-      <w:r>
-        <w:t>Ne felejtsd el megszüntetni az úsztatást az oldal alján!</w:t>
-      </w:r>
-      <w:r>
-        <w:t xml:space="preserve"> </w:t>
-      </w:r>
-      <w:r>
-        <w:rPr>
-          <w:strike/>
-        </w:rPr>
-        <w:t xml:space="preserve">Vagy használhatsz </w:t>
-      </w:r>
-      <w:proofErr w:type="spellStart"/>
-      <w:r>
-        <w:rPr>
-          <w:strike/>
-        </w:rPr>
-        <w:t>grideket</w:t>
-      </w:r>
-      <w:proofErr w:type="spellEnd"/>
-      <w:r>
-        <w:rPr>
-          <w:strike/>
-        </w:rPr>
-        <w:t xml:space="preserve"> is az elrendezéshez.</w:t>
-      </w:r>
-    </w:p>
-    <w:p>
-      <w:pPr>
-        <w:pStyle w:val="Listaszerbekezds"/>
-        <w:numPr>
-          <w:ilvl w:val="0"/>
-          <w:numId w:val="2"/>
-        </w:numPr>
-      </w:pPr>
-      <w:r>
-        <w:rPr>
-          <w:b/>
-          <w:bCs/>
-        </w:rPr>
-        <w:t xml:space="preserve">A felsorolások előtti jel legyen </w:t>
-      </w:r>
-      <w:proofErr w:type="spellStart"/>
-      <w:r>
-        <w:rPr>
-          <w:b/>
-          <w:bCs/>
-        </w:rPr>
-        <w:t>square</w:t>
-      </w:r>
-      <w:proofErr w:type="spellEnd"/>
-      <w:r>
-        <w:rPr>
-          <w:b/>
-          <w:bCs/>
-        </w:rPr>
-        <w:t xml:space="preserve"> (négyzet).</w:t>
-      </w:r>
-      <w:r>
-        <w:t xml:space="preserve"> </w:t>
-      </w:r>
-      <w:r>
-        <w:rPr>
-          <w:strike/>
-        </w:rPr>
-        <w:t xml:space="preserve">Az oldal legyen reszponzív! </w:t>
-      </w:r>
-    </w:p>
-    <w:p/>
-    <w:p>
-      <w:pPr>
-        <w:pStyle w:val="Listaszerbekezds"/>
-        <w:numPr>
-          <w:ilvl w:val="0"/>
-          <w:numId w:val="2"/>
-        </w:numPr>
-        <w:rPr>
-          <w:strike/>
-        </w:rPr>
-      </w:pPr>
-      <w:r>
-        <w:rPr>
-          <w:strike/>
-        </w:rPr>
-        <w:t xml:space="preserve">Mobil nézetben </w:t>
-      </w:r>
-      <w:proofErr w:type="gramStart"/>
-      <w:r>
-        <w:rPr>
-          <w:strike/>
-        </w:rPr>
-        <w:t>a  menüpontok</w:t>
-      </w:r>
-      <w:proofErr w:type="gramEnd"/>
-      <w:r>
-        <w:rPr>
-          <w:strike/>
-        </w:rPr>
-        <w:t xml:space="preserve"> kerüljenek egymás alá, és a felsorolás kerüljön a kép fölé. </w:t>
+        <w:t xml:space="preserve">Mobil nézetben a  menüpontok kerüljenek egymás alá, és a felsorolás kerüljön a kép fölé. </w:t>
       </w:r>
     </w:p>
     <w:p>
@@ -1055,7 +1254,7 @@
 </file>
 
 <file path=word/numbering.xml><?xml version="1.0" encoding="utf-8"?>
-<w:numbering xmlns:wpc="http://schemas.microsoft.com/office/word/2010/wordprocessingCanvas" xmlns:cx="http://schemas.microsoft.com/office/drawing/2014/chartex" xmlns:cx1="http://schemas.microsoft.com/office/drawing/2015/9/8/chartex" xmlns:cx2="http://schemas.microsoft.com/office/drawing/2015/10/21/chartex" xmlns:cx3="http://schemas.microsoft.com/office/drawing/2016/5/9/chartex" xmlns:cx4="http://schemas.microsoft.com/office/drawing/2016/5/10/chartex" xmlns:cx5="http://schemas.microsoft.com/office/drawing/2016/5/11/chartex" xmlns:cx6="http://schemas.microsoft.com/office/drawing/2016/5/12/chartex" xmlns:cx7="http://schemas.microsoft.com/office/drawing/2016/5/13/chartex" xmlns:cx8="http://schemas.microsoft.com/office/drawing/2016/5/14/chartex" xmlns:mc="http://schemas.openxmlformats.org/markup-compatibility/2006" xmlns:aink="http://schemas.microsoft.com/office/drawing/2016/ink" xmlns:am3d="http://schemas.microsoft.com/office/drawing/2017/model3d" xmlns:o="urn:schemas-microsoft-com:office:office" xmlns:r="http://schemas.openxmlformats.org/officeDocument/2006/relationships" xmlns:m="http://schemas.openxmlformats.org/officeDocument/2006/math" xmlns:v="urn:schemas-microsoft-com:vml" xmlns:wp14="http://schemas.microsoft.com/office/word/2010/wordprocessingDrawing" xmlns:wp="http://schemas.openxmlformats.org/drawingml/2006/wordprocessingDrawing" xmlns:w10="urn:schemas-microsoft-com:office:word" xmlns:w="http://schemas.openxmlformats.org/wordprocessingml/2006/main" xmlns:w14="http://schemas.microsoft.com/office/word/2010/wordml" xmlns:w15="http://schemas.microsoft.com/office/word/2012/wordml" xmlns:w16cex="http://schemas.microsoft.com/office/word/2018/wordml/cex" xmlns:w16cid="http://schemas.microsoft.com/office/word/2016/wordml/cid" xmlns:w16="http://schemas.microsoft.com/office/word/2018/wordml" xmlns:w16sdtdh="http://schemas.microsoft.com/office/word/2020/wordml/sdtdatahash" xmlns:w16se="http://schemas.microsoft.com/office/word/2015/wordml/symex" xmlns:wpg="http://schemas.microsoft.com/office/word/2010/wordprocessingGroup" xmlns:wpi="http://schemas.microsoft.com/office/word/2010/wordprocessingInk" xmlns:wne="http://schemas.microsoft.com/office/word/2006/wordml" xmlns:wps="http://schemas.microsoft.com/office/word/2010/wordprocessingShape" mc:Ignorable="w14 w15 w16se w16cid w16 w16cex w16sdtdh wp14">
+<w:numbering xmlns:wpc="http://schemas.microsoft.com/office/word/2010/wordprocessingCanvas" xmlns:cx="http://schemas.microsoft.com/office/drawing/2014/chartex" xmlns:cx1="http://schemas.microsoft.com/office/drawing/2015/9/8/chartex" xmlns:cx2="http://schemas.microsoft.com/office/drawing/2015/10/21/chartex" xmlns:cx3="http://schemas.microsoft.com/office/drawing/2016/5/9/chartex" xmlns:cx4="http://schemas.microsoft.com/office/drawing/2016/5/10/chartex" xmlns:cx5="http://schemas.microsoft.com/office/drawing/2016/5/11/chartex" xmlns:cx6="http://schemas.microsoft.com/office/drawing/2016/5/12/chartex" xmlns:cx7="http://schemas.microsoft.com/office/drawing/2016/5/13/chartex" xmlns:cx8="http://schemas.microsoft.com/office/drawing/2016/5/14/chartex" xmlns:mc="http://schemas.openxmlformats.org/markup-compatibility/2006" xmlns:aink="http://schemas.microsoft.com/office/drawing/2016/ink" xmlns:am3d="http://schemas.microsoft.com/office/drawing/2017/model3d" xmlns:o="urn:schemas-microsoft-com:office:office" xmlns:oel="http://schemas.microsoft.com/office/2019/extlst" xmlns:r="http://schemas.openxmlformats.org/officeDocument/2006/relationships" xmlns:m="http://schemas.openxmlformats.org/officeDocument/2006/math" xmlns:v="urn:schemas-microsoft-com:vml" xmlns:wp14="http://schemas.microsoft.com/office/word/2010/wordprocessingDrawing" xmlns:wp="http://schemas.openxmlformats.org/drawingml/2006/wordprocessingDrawing" xmlns:w10="urn:schemas-microsoft-com:office:word" xmlns:w="http://schemas.openxmlformats.org/wordprocessingml/2006/main" xmlns:w14="http://schemas.microsoft.com/office/word/2010/wordml" xmlns:w15="http://schemas.microsoft.com/office/word/2012/wordml" xmlns:w16cex="http://schemas.microsoft.com/office/word/2018/wordml/cex" xmlns:w16cid="http://schemas.microsoft.com/office/word/2016/wordml/cid" xmlns:w16="http://schemas.microsoft.com/office/word/2018/wordml" xmlns:w16du="http://schemas.microsoft.com/office/word/2023/wordml/word16du" xmlns:w16sdtdh="http://schemas.microsoft.com/office/word/2020/wordml/sdtdatahash" xmlns:w16sdtfl="http://schemas.microsoft.com/office/word/2024/wordml/sdtformatlock" xmlns:w16se="http://schemas.microsoft.com/office/word/2015/wordml/symex" xmlns:wpg="http://schemas.microsoft.com/office/word/2010/wordprocessingGroup" xmlns:wpi="http://schemas.microsoft.com/office/word/2010/wordprocessingInk" xmlns:wne="http://schemas.microsoft.com/office/word/2006/wordml" xmlns:wps="http://schemas.microsoft.com/office/word/2010/wordprocessingShape" mc:Ignorable="w14 w15 w16se w16cid w16 w16cex w16sdtdh w16sdtfl w16du wp14">
   <w:abstractNum w:abstractNumId="0" w15:restartNumberingAfterBreak="0">
     <w:nsid w:val="40B35AC9"/>
     <w:multiLevelType w:val="hybridMultilevel"/>
@@ -1341,20 +1540,20 @@
       </w:pPr>
     </w:lvl>
   </w:abstractNum>
-  <w:num w:numId="1">
+  <w:num w:numId="1" w16cid:durableId="370227751">
     <w:abstractNumId w:val="2"/>
   </w:num>
-  <w:num w:numId="2">
+  <w:num w:numId="2" w16cid:durableId="976225919">
     <w:abstractNumId w:val="1"/>
   </w:num>
-  <w:num w:numId="3">
+  <w:num w:numId="3" w16cid:durableId="695884917">
     <w:abstractNumId w:val="0"/>
   </w:num>
 </w:numbering>
 </file>
 
 <file path=word/styles.xml><?xml version="1.0" encoding="utf-8"?>
-<w:styles xmlns:mc="http://schemas.openxmlformats.org/markup-compatibility/2006" xmlns:r="http://schemas.openxmlformats.org/officeDocument/2006/relationships" xmlns:w="http://schemas.openxmlformats.org/wordprocessingml/2006/main" xmlns:w14="http://schemas.microsoft.com/office/word/2010/wordml" xmlns:w15="http://schemas.microsoft.com/office/word/2012/wordml" xmlns:w16cex="http://schemas.microsoft.com/office/word/2018/wordml/cex" xmlns:w16cid="http://schemas.microsoft.com/office/word/2016/wordml/cid" xmlns:w16="http://schemas.microsoft.com/office/word/2018/wordml" xmlns:w16sdtdh="http://schemas.microsoft.com/office/word/2020/wordml/sdtdatahash" xmlns:w16se="http://schemas.microsoft.com/office/word/2015/wordml/symex" mc:Ignorable="w14 w15 w16se w16cid w16 w16cex w16sdtdh">
+<w:styles xmlns:mc="http://schemas.openxmlformats.org/markup-compatibility/2006" xmlns:r="http://schemas.openxmlformats.org/officeDocument/2006/relationships" xmlns:w="http://schemas.openxmlformats.org/wordprocessingml/2006/main" xmlns:w14="http://schemas.microsoft.com/office/word/2010/wordml" xmlns:w15="http://schemas.microsoft.com/office/word/2012/wordml" xmlns:w16cex="http://schemas.microsoft.com/office/word/2018/wordml/cex" xmlns:w16cid="http://schemas.microsoft.com/office/word/2016/wordml/cid" xmlns:w16="http://schemas.microsoft.com/office/word/2018/wordml" xmlns:w16du="http://schemas.microsoft.com/office/word/2023/wordml/word16du" xmlns:w16sdtdh="http://schemas.microsoft.com/office/word/2020/wordml/sdtdatahash" xmlns:w16sdtfl="http://schemas.microsoft.com/office/word/2024/wordml/sdtformatlock" xmlns:w16se="http://schemas.microsoft.com/office/word/2015/wordml/symex" mc:Ignorable="w14 w15 w16se w16cid w16 w16cex w16sdtdh w16sdtfl w16du">
   <w:docDefaults>
     <w:rPrDefault>
       <w:rPr>

</xml_diff>